<commit_message>
fix: fix docx file
</commit_message>
<xml_diff>
--- a/Slot-1/Spring-boot-Git.docx
+++ b/Slot-1/Spring-boot-Git.docx
@@ -29,21 +29,7 @@
             <w:rStyle w:val="Hyperlink"/>
             <w:noProof/>
           </w:rPr>
-          <w:t>1. PHÂN BIỆT SPRING BOOT</w:t>
-        </w:r>
-        <w:r>
-          <w:rPr>
-            <w:rStyle w:val="Hyperlink"/>
-            <w:noProof/>
-          </w:rPr>
-          <w:t xml:space="preserve"> </w:t>
-        </w:r>
-        <w:r>
-          <w:rPr>
-            <w:rStyle w:val="Hyperlink"/>
-            <w:noProof/>
-          </w:rPr>
-          <w:t>VÀ SPRING FRAMEWORK</w:t>
+          <w:t>1. PHÂN BIỆT SPRING BOOT VÀ SPRING FRAMEWORK</w:t>
         </w:r>
         <w:r>
           <w:rPr>
@@ -533,21 +519,7 @@
             <w:rStyle w:val="Hyperlink"/>
             <w:noProof/>
           </w:rPr>
-          <w:t xml:space="preserve">3. GIT VÀ CÁC </w:t>
-        </w:r>
-        <w:r>
-          <w:rPr>
-            <w:rStyle w:val="Hyperlink"/>
-            <w:noProof/>
-          </w:rPr>
-          <w:t>C</w:t>
-        </w:r>
-        <w:r>
-          <w:rPr>
-            <w:rStyle w:val="Hyperlink"/>
-            <w:noProof/>
-          </w:rPr>
-          <w:t>ÂU LỆNH CƠ BẢN</w:t>
+          <w:t>3. GIT VÀ CÁC CÂU LỆNH CƠ BẢN</w:t>
         </w:r>
         <w:r>
           <w:rPr>
@@ -1078,21 +1050,7 @@
             <w:rStyle w:val="Hyperlink"/>
             <w:noProof/>
           </w:rPr>
-          <w:t>H</w:t>
-        </w:r>
-        <w:r>
-          <w:rPr>
-            <w:rStyle w:val="Hyperlink"/>
-            <w:noProof/>
-          </w:rPr>
-          <w:t>ì</w:t>
-        </w:r>
-        <w:r>
-          <w:rPr>
-            <w:rStyle w:val="Hyperlink"/>
-            <w:noProof/>
-          </w:rPr>
-          <w:t>nh 1</w:t>
+          <w:t>Hình 1</w:t>
         </w:r>
         <w:r>
           <w:rPr>
@@ -1723,9 +1681,9 @@
         <w:tblLook w:val="04A0" w:firstRow="1" w:lastRow="0" w:firstColumn="1" w:lastColumn="0" w:noHBand="0" w:noVBand="1"/>
       </w:tblPr>
       <w:tblGrid>
-        <w:gridCol w:w="1286"/>
-        <w:gridCol w:w="3918"/>
-        <w:gridCol w:w="4140"/>
+        <w:gridCol w:w="1361"/>
+        <w:gridCol w:w="3886"/>
+        <w:gridCol w:w="4097"/>
       </w:tblGrid>
       <w:tr>
         <w:trPr>
@@ -1751,27 +1709,43 @@
             <w:hideMark/>
           </w:tcPr>
           <w:p>
+            <w:pPr>
+              <w:rPr>
+                <w:rFonts w:ascii="Times New Roman" w:hAnsi="Times New Roman" w:cs="Times New Roman"/>
+                <w:sz w:val="26"/>
+                <w:szCs w:val="26"/>
+              </w:rPr>
+            </w:pPr>
             <w:proofErr w:type="spellStart"/>
             <w:r>
               <w:rPr>
+                <w:rFonts w:ascii="Times New Roman" w:hAnsi="Times New Roman" w:cs="Times New Roman"/>
                 <w:b/>
                 <w:bCs/>
+                <w:sz w:val="26"/>
+                <w:szCs w:val="26"/>
               </w:rPr>
               <w:t>Tiêu</w:t>
             </w:r>
             <w:proofErr w:type="spellEnd"/>
             <w:r>
               <w:rPr>
+                <w:rFonts w:ascii="Times New Roman" w:hAnsi="Times New Roman" w:cs="Times New Roman"/>
                 <w:b/>
                 <w:bCs/>
+                <w:sz w:val="26"/>
+                <w:szCs w:val="26"/>
               </w:rPr>
               <w:t xml:space="preserve"> </w:t>
             </w:r>
             <w:proofErr w:type="spellStart"/>
             <w:r>
               <w:rPr>
+                <w:rFonts w:ascii="Times New Roman" w:hAnsi="Times New Roman" w:cs="Times New Roman"/>
                 <w:b/>
                 <w:bCs/>
+                <w:sz w:val="26"/>
+                <w:szCs w:val="26"/>
               </w:rPr>
               <w:t>chí</w:t>
             </w:r>
@@ -1797,10 +1771,20 @@
             <w:hideMark/>
           </w:tcPr>
           <w:p>
-            <w:r>
-              <w:rPr>
+            <w:pPr>
+              <w:rPr>
+                <w:rFonts w:ascii="Times New Roman" w:hAnsi="Times New Roman" w:cs="Times New Roman"/>
+                <w:sz w:val="26"/>
+                <w:szCs w:val="26"/>
+              </w:rPr>
+            </w:pPr>
+            <w:r>
+              <w:rPr>
+                <w:rFonts w:ascii="Times New Roman" w:hAnsi="Times New Roman" w:cs="Times New Roman"/>
                 <w:b/>
                 <w:bCs/>
+                <w:sz w:val="26"/>
+                <w:szCs w:val="26"/>
               </w:rPr>
               <w:t>Spring Framework</w:t>
             </w:r>
@@ -1825,10 +1809,20 @@
             <w:hideMark/>
           </w:tcPr>
           <w:p>
-            <w:r>
-              <w:rPr>
+            <w:pPr>
+              <w:rPr>
+                <w:rFonts w:ascii="Times New Roman" w:hAnsi="Times New Roman" w:cs="Times New Roman"/>
+                <w:sz w:val="26"/>
+                <w:szCs w:val="26"/>
+              </w:rPr>
+            </w:pPr>
+            <w:r>
+              <w:rPr>
+                <w:rFonts w:ascii="Times New Roman" w:hAnsi="Times New Roman" w:cs="Times New Roman"/>
                 <w:b/>
                 <w:bCs/>
+                <w:sz w:val="26"/>
+                <w:szCs w:val="26"/>
               </w:rPr>
               <w:t>Spring Boot</w:t>
             </w:r>
@@ -1858,27 +1852,43 @@
             <w:hideMark/>
           </w:tcPr>
           <w:p>
+            <w:pPr>
+              <w:rPr>
+                <w:rFonts w:ascii="Times New Roman" w:hAnsi="Times New Roman" w:cs="Times New Roman"/>
+                <w:sz w:val="26"/>
+                <w:szCs w:val="26"/>
+              </w:rPr>
+            </w:pPr>
             <w:proofErr w:type="spellStart"/>
             <w:r>
               <w:rPr>
+                <w:rFonts w:ascii="Times New Roman" w:hAnsi="Times New Roman" w:cs="Times New Roman"/>
                 <w:b/>
                 <w:bCs/>
+                <w:sz w:val="26"/>
+                <w:szCs w:val="26"/>
               </w:rPr>
               <w:t>Cấu</w:t>
             </w:r>
             <w:proofErr w:type="spellEnd"/>
             <w:r>
               <w:rPr>
+                <w:rFonts w:ascii="Times New Roman" w:hAnsi="Times New Roman" w:cs="Times New Roman"/>
                 <w:b/>
                 <w:bCs/>
+                <w:sz w:val="26"/>
+                <w:szCs w:val="26"/>
               </w:rPr>
               <w:t xml:space="preserve"> </w:t>
             </w:r>
             <w:proofErr w:type="spellStart"/>
             <w:r>
               <w:rPr>
+                <w:rFonts w:ascii="Times New Roman" w:hAnsi="Times New Roman" w:cs="Times New Roman"/>
                 <w:b/>
                 <w:bCs/>
+                <w:sz w:val="26"/>
+                <w:szCs w:val="26"/>
               </w:rPr>
               <w:t>hình</w:t>
             </w:r>
@@ -1904,84 +1914,191 @@
             <w:hideMark/>
           </w:tcPr>
           <w:p>
+            <w:pPr>
+              <w:rPr>
+                <w:rFonts w:ascii="Times New Roman" w:hAnsi="Times New Roman" w:cs="Times New Roman"/>
+                <w:sz w:val="26"/>
+                <w:szCs w:val="26"/>
+              </w:rPr>
+            </w:pPr>
             <w:proofErr w:type="spellStart"/>
             <w:r>
+              <w:rPr>
+                <w:rFonts w:ascii="Times New Roman" w:hAnsi="Times New Roman" w:cs="Times New Roman"/>
+                <w:sz w:val="26"/>
+                <w:szCs w:val="26"/>
+              </w:rPr>
               <w:t>Thủ</w:t>
             </w:r>
             <w:proofErr w:type="spellEnd"/>
             <w:r>
+              <w:rPr>
+                <w:rFonts w:ascii="Times New Roman" w:hAnsi="Times New Roman" w:cs="Times New Roman"/>
+                <w:sz w:val="26"/>
+                <w:szCs w:val="26"/>
+              </w:rPr>
               <w:t xml:space="preserve"> </w:t>
             </w:r>
             <w:proofErr w:type="spellStart"/>
             <w:r>
+              <w:rPr>
+                <w:rFonts w:ascii="Times New Roman" w:hAnsi="Times New Roman" w:cs="Times New Roman"/>
+                <w:sz w:val="26"/>
+                <w:szCs w:val="26"/>
+              </w:rPr>
               <w:t>công</w:t>
             </w:r>
             <w:proofErr w:type="spellEnd"/>
             <w:r>
+              <w:rPr>
+                <w:rFonts w:ascii="Times New Roman" w:hAnsi="Times New Roman" w:cs="Times New Roman"/>
+                <w:sz w:val="26"/>
+                <w:szCs w:val="26"/>
+              </w:rPr>
               <w:t xml:space="preserve"> (XML </w:t>
             </w:r>
             <w:proofErr w:type="spellStart"/>
             <w:r>
+              <w:rPr>
+                <w:rFonts w:ascii="Times New Roman" w:hAnsi="Times New Roman" w:cs="Times New Roman"/>
+                <w:sz w:val="26"/>
+                <w:szCs w:val="26"/>
+              </w:rPr>
               <w:t>hoặc</w:t>
             </w:r>
             <w:proofErr w:type="spellEnd"/>
             <w:r>
+              <w:rPr>
+                <w:rFonts w:ascii="Times New Roman" w:hAnsi="Times New Roman" w:cs="Times New Roman"/>
+                <w:sz w:val="26"/>
+                <w:szCs w:val="26"/>
+              </w:rPr>
               <w:t xml:space="preserve"> Java Annotations). </w:t>
             </w:r>
             <w:proofErr w:type="spellStart"/>
             <w:r>
+              <w:rPr>
+                <w:rFonts w:ascii="Times New Roman" w:hAnsi="Times New Roman" w:cs="Times New Roman"/>
+                <w:sz w:val="26"/>
+                <w:szCs w:val="26"/>
+              </w:rPr>
               <w:t>Tốn</w:t>
             </w:r>
             <w:proofErr w:type="spellEnd"/>
             <w:r>
+              <w:rPr>
+                <w:rFonts w:ascii="Times New Roman" w:hAnsi="Times New Roman" w:cs="Times New Roman"/>
+                <w:sz w:val="26"/>
+                <w:szCs w:val="26"/>
+              </w:rPr>
               <w:t xml:space="preserve"> </w:t>
             </w:r>
             <w:proofErr w:type="spellStart"/>
             <w:r>
+              <w:rPr>
+                <w:rFonts w:ascii="Times New Roman" w:hAnsi="Times New Roman" w:cs="Times New Roman"/>
+                <w:sz w:val="26"/>
+                <w:szCs w:val="26"/>
+              </w:rPr>
               <w:t>nhiều</w:t>
             </w:r>
             <w:proofErr w:type="spellEnd"/>
             <w:r>
+              <w:rPr>
+                <w:rFonts w:ascii="Times New Roman" w:hAnsi="Times New Roman" w:cs="Times New Roman"/>
+                <w:sz w:val="26"/>
+                <w:szCs w:val="26"/>
+              </w:rPr>
               <w:t xml:space="preserve"> </w:t>
             </w:r>
             <w:proofErr w:type="spellStart"/>
             <w:r>
+              <w:rPr>
+                <w:rFonts w:ascii="Times New Roman" w:hAnsi="Times New Roman" w:cs="Times New Roman"/>
+                <w:sz w:val="26"/>
+                <w:szCs w:val="26"/>
+              </w:rPr>
               <w:t>thời</w:t>
             </w:r>
             <w:proofErr w:type="spellEnd"/>
             <w:r>
+              <w:rPr>
+                <w:rFonts w:ascii="Times New Roman" w:hAnsi="Times New Roman" w:cs="Times New Roman"/>
+                <w:sz w:val="26"/>
+                <w:szCs w:val="26"/>
+              </w:rPr>
               <w:t xml:space="preserve"> </w:t>
             </w:r>
             <w:proofErr w:type="spellStart"/>
             <w:r>
+              <w:rPr>
+                <w:rFonts w:ascii="Times New Roman" w:hAnsi="Times New Roman" w:cs="Times New Roman"/>
+                <w:sz w:val="26"/>
+                <w:szCs w:val="26"/>
+              </w:rPr>
               <w:t>gian</w:t>
             </w:r>
             <w:proofErr w:type="spellEnd"/>
             <w:r>
+              <w:rPr>
+                <w:rFonts w:ascii="Times New Roman" w:hAnsi="Times New Roman" w:cs="Times New Roman"/>
+                <w:sz w:val="26"/>
+                <w:szCs w:val="26"/>
+              </w:rPr>
               <w:t xml:space="preserve"> </w:t>
             </w:r>
             <w:proofErr w:type="spellStart"/>
             <w:r>
+              <w:rPr>
+                <w:rFonts w:ascii="Times New Roman" w:hAnsi="Times New Roman" w:cs="Times New Roman"/>
+                <w:sz w:val="26"/>
+                <w:szCs w:val="26"/>
+              </w:rPr>
               <w:t>thiết</w:t>
             </w:r>
             <w:proofErr w:type="spellEnd"/>
             <w:r>
+              <w:rPr>
+                <w:rFonts w:ascii="Times New Roman" w:hAnsi="Times New Roman" w:cs="Times New Roman"/>
+                <w:sz w:val="26"/>
+                <w:szCs w:val="26"/>
+              </w:rPr>
               <w:t xml:space="preserve"> </w:t>
             </w:r>
             <w:proofErr w:type="spellStart"/>
             <w:r>
+              <w:rPr>
+                <w:rFonts w:ascii="Times New Roman" w:hAnsi="Times New Roman" w:cs="Times New Roman"/>
+                <w:sz w:val="26"/>
+                <w:szCs w:val="26"/>
+              </w:rPr>
               <w:t>lập</w:t>
             </w:r>
             <w:proofErr w:type="spellEnd"/>
             <w:r>
+              <w:rPr>
+                <w:rFonts w:ascii="Times New Roman" w:hAnsi="Times New Roman" w:cs="Times New Roman"/>
+                <w:sz w:val="26"/>
+                <w:szCs w:val="26"/>
+              </w:rPr>
               <w:t xml:space="preserve"> ban </w:t>
             </w:r>
             <w:proofErr w:type="spellStart"/>
             <w:r>
+              <w:rPr>
+                <w:rFonts w:ascii="Times New Roman" w:hAnsi="Times New Roman" w:cs="Times New Roman"/>
+                <w:sz w:val="26"/>
+                <w:szCs w:val="26"/>
+              </w:rPr>
               <w:t>đầu</w:t>
             </w:r>
             <w:proofErr w:type="spellEnd"/>
             <w:r>
+              <w:rPr>
+                <w:rFonts w:ascii="Times New Roman" w:hAnsi="Times New Roman" w:cs="Times New Roman"/>
+                <w:sz w:val="26"/>
+                <w:szCs w:val="26"/>
+              </w:rPr>
               <w:t>.</w:t>
             </w:r>
           </w:p>
@@ -2005,86 +2122,191 @@
             <w:hideMark/>
           </w:tcPr>
           <w:p>
-            <w:r>
-              <w:rPr>
+            <w:pPr>
+              <w:rPr>
+                <w:rFonts w:ascii="Times New Roman" w:hAnsi="Times New Roman" w:cs="Times New Roman"/>
+                <w:sz w:val="26"/>
+                <w:szCs w:val="26"/>
+              </w:rPr>
+            </w:pPr>
+            <w:r>
+              <w:rPr>
+                <w:rFonts w:ascii="Times New Roman" w:hAnsi="Times New Roman" w:cs="Times New Roman"/>
                 <w:b/>
                 <w:bCs/>
+                <w:sz w:val="26"/>
+                <w:szCs w:val="26"/>
               </w:rPr>
               <w:t>Auto-configuration</w:t>
             </w:r>
             <w:r>
+              <w:rPr>
+                <w:rFonts w:ascii="Times New Roman" w:hAnsi="Times New Roman" w:cs="Times New Roman"/>
+                <w:sz w:val="26"/>
+                <w:szCs w:val="26"/>
+              </w:rPr>
               <w:t xml:space="preserve">. </w:t>
             </w:r>
             <w:proofErr w:type="spellStart"/>
             <w:r>
+              <w:rPr>
+                <w:rFonts w:ascii="Times New Roman" w:hAnsi="Times New Roman" w:cs="Times New Roman"/>
+                <w:sz w:val="26"/>
+                <w:szCs w:val="26"/>
+              </w:rPr>
               <w:t>Tự</w:t>
             </w:r>
             <w:proofErr w:type="spellEnd"/>
             <w:r>
+              <w:rPr>
+                <w:rFonts w:ascii="Times New Roman" w:hAnsi="Times New Roman" w:cs="Times New Roman"/>
+                <w:sz w:val="26"/>
+                <w:szCs w:val="26"/>
+              </w:rPr>
               <w:t xml:space="preserve"> </w:t>
             </w:r>
             <w:proofErr w:type="spellStart"/>
             <w:r>
+              <w:rPr>
+                <w:rFonts w:ascii="Times New Roman" w:hAnsi="Times New Roman" w:cs="Times New Roman"/>
+                <w:sz w:val="26"/>
+                <w:szCs w:val="26"/>
+              </w:rPr>
               <w:t>động</w:t>
             </w:r>
             <w:proofErr w:type="spellEnd"/>
             <w:r>
+              <w:rPr>
+                <w:rFonts w:ascii="Times New Roman" w:hAnsi="Times New Roman" w:cs="Times New Roman"/>
+                <w:sz w:val="26"/>
+                <w:szCs w:val="26"/>
+              </w:rPr>
               <w:t xml:space="preserve"> </w:t>
             </w:r>
             <w:proofErr w:type="spellStart"/>
             <w:r>
+              <w:rPr>
+                <w:rFonts w:ascii="Times New Roman" w:hAnsi="Times New Roman" w:cs="Times New Roman"/>
+                <w:sz w:val="26"/>
+                <w:szCs w:val="26"/>
+              </w:rPr>
               <w:t>cấu</w:t>
             </w:r>
             <w:proofErr w:type="spellEnd"/>
             <w:r>
+              <w:rPr>
+                <w:rFonts w:ascii="Times New Roman" w:hAnsi="Times New Roman" w:cs="Times New Roman"/>
+                <w:sz w:val="26"/>
+                <w:szCs w:val="26"/>
+              </w:rPr>
               <w:t xml:space="preserve"> </w:t>
             </w:r>
             <w:proofErr w:type="spellStart"/>
             <w:r>
+              <w:rPr>
+                <w:rFonts w:ascii="Times New Roman" w:hAnsi="Times New Roman" w:cs="Times New Roman"/>
+                <w:sz w:val="26"/>
+                <w:szCs w:val="26"/>
+              </w:rPr>
               <w:t>hình</w:t>
             </w:r>
             <w:proofErr w:type="spellEnd"/>
             <w:r>
+              <w:rPr>
+                <w:rFonts w:ascii="Times New Roman" w:hAnsi="Times New Roman" w:cs="Times New Roman"/>
+                <w:sz w:val="26"/>
+                <w:szCs w:val="26"/>
+              </w:rPr>
               <w:t xml:space="preserve"> </w:t>
             </w:r>
             <w:proofErr w:type="spellStart"/>
             <w:r>
+              <w:rPr>
+                <w:rFonts w:ascii="Times New Roman" w:hAnsi="Times New Roman" w:cs="Times New Roman"/>
+                <w:sz w:val="26"/>
+                <w:szCs w:val="26"/>
+              </w:rPr>
               <w:t>dựa</w:t>
             </w:r>
             <w:proofErr w:type="spellEnd"/>
             <w:r>
+              <w:rPr>
+                <w:rFonts w:ascii="Times New Roman" w:hAnsi="Times New Roman" w:cs="Times New Roman"/>
+                <w:sz w:val="26"/>
+                <w:szCs w:val="26"/>
+              </w:rPr>
               <w:t xml:space="preserve"> </w:t>
             </w:r>
             <w:proofErr w:type="spellStart"/>
             <w:r>
+              <w:rPr>
+                <w:rFonts w:ascii="Times New Roman" w:hAnsi="Times New Roman" w:cs="Times New Roman"/>
+                <w:sz w:val="26"/>
+                <w:szCs w:val="26"/>
+              </w:rPr>
               <w:t>trên</w:t>
             </w:r>
             <w:proofErr w:type="spellEnd"/>
             <w:r>
+              <w:rPr>
+                <w:rFonts w:ascii="Times New Roman" w:hAnsi="Times New Roman" w:cs="Times New Roman"/>
+                <w:sz w:val="26"/>
+                <w:szCs w:val="26"/>
+              </w:rPr>
               <w:t xml:space="preserve"> </w:t>
             </w:r>
             <w:proofErr w:type="spellStart"/>
             <w:r>
+              <w:rPr>
+                <w:rFonts w:ascii="Times New Roman" w:hAnsi="Times New Roman" w:cs="Times New Roman"/>
+                <w:sz w:val="26"/>
+                <w:szCs w:val="26"/>
+              </w:rPr>
               <w:t>các</w:t>
             </w:r>
             <w:proofErr w:type="spellEnd"/>
             <w:r>
+              <w:rPr>
+                <w:rFonts w:ascii="Times New Roman" w:hAnsi="Times New Roman" w:cs="Times New Roman"/>
+                <w:sz w:val="26"/>
+                <w:szCs w:val="26"/>
+              </w:rPr>
               <w:t xml:space="preserve"> dependency </w:t>
             </w:r>
             <w:proofErr w:type="spellStart"/>
             <w:r>
+              <w:rPr>
+                <w:rFonts w:ascii="Times New Roman" w:hAnsi="Times New Roman" w:cs="Times New Roman"/>
+                <w:sz w:val="26"/>
+                <w:szCs w:val="26"/>
+              </w:rPr>
               <w:t>có</w:t>
             </w:r>
             <w:proofErr w:type="spellEnd"/>
             <w:r>
+              <w:rPr>
+                <w:rFonts w:ascii="Times New Roman" w:hAnsi="Times New Roman" w:cs="Times New Roman"/>
+                <w:sz w:val="26"/>
+                <w:szCs w:val="26"/>
+              </w:rPr>
               <w:t xml:space="preserve"> </w:t>
             </w:r>
             <w:proofErr w:type="spellStart"/>
             <w:r>
+              <w:rPr>
+                <w:rFonts w:ascii="Times New Roman" w:hAnsi="Times New Roman" w:cs="Times New Roman"/>
+                <w:sz w:val="26"/>
+                <w:szCs w:val="26"/>
+              </w:rPr>
               <w:t>trong</w:t>
             </w:r>
             <w:proofErr w:type="spellEnd"/>
             <w:r>
+              <w:rPr>
+                <w:rFonts w:ascii="Times New Roman" w:hAnsi="Times New Roman" w:cs="Times New Roman"/>
+                <w:sz w:val="26"/>
+                <w:szCs w:val="26"/>
+              </w:rPr>
               <w:t xml:space="preserve"> project.</w:t>
             </w:r>
           </w:p>
@@ -2113,10 +2335,20 @@
             <w:hideMark/>
           </w:tcPr>
           <w:p>
-            <w:r>
-              <w:rPr>
+            <w:pPr>
+              <w:rPr>
+                <w:rFonts w:ascii="Times New Roman" w:hAnsi="Times New Roman" w:cs="Times New Roman"/>
+                <w:sz w:val="26"/>
+                <w:szCs w:val="26"/>
+              </w:rPr>
+            </w:pPr>
+            <w:r>
+              <w:rPr>
+                <w:rFonts w:ascii="Times New Roman" w:hAnsi="Times New Roman" w:cs="Times New Roman"/>
                 <w:b/>
                 <w:bCs/>
+                <w:sz w:val="26"/>
+                <w:szCs w:val="26"/>
               </w:rPr>
               <w:t>Server</w:t>
             </w:r>
@@ -2141,68 +2373,155 @@
             <w:hideMark/>
           </w:tcPr>
           <w:p>
+            <w:pPr>
+              <w:rPr>
+                <w:rFonts w:ascii="Times New Roman" w:hAnsi="Times New Roman" w:cs="Times New Roman"/>
+                <w:sz w:val="26"/>
+                <w:szCs w:val="26"/>
+              </w:rPr>
+            </w:pPr>
             <w:proofErr w:type="spellStart"/>
             <w:r>
+              <w:rPr>
+                <w:rFonts w:ascii="Times New Roman" w:hAnsi="Times New Roman" w:cs="Times New Roman"/>
+                <w:sz w:val="26"/>
+                <w:szCs w:val="26"/>
+              </w:rPr>
               <w:t>Cần</w:t>
             </w:r>
             <w:proofErr w:type="spellEnd"/>
             <w:r>
+              <w:rPr>
+                <w:rFonts w:ascii="Times New Roman" w:hAnsi="Times New Roman" w:cs="Times New Roman"/>
+                <w:sz w:val="26"/>
+                <w:szCs w:val="26"/>
+              </w:rPr>
               <w:t xml:space="preserve"> </w:t>
             </w:r>
             <w:proofErr w:type="spellStart"/>
             <w:r>
+              <w:rPr>
+                <w:rFonts w:ascii="Times New Roman" w:hAnsi="Times New Roman" w:cs="Times New Roman"/>
+                <w:sz w:val="26"/>
+                <w:szCs w:val="26"/>
+              </w:rPr>
               <w:t>cài</w:t>
             </w:r>
             <w:proofErr w:type="spellEnd"/>
             <w:r>
+              <w:rPr>
+                <w:rFonts w:ascii="Times New Roman" w:hAnsi="Times New Roman" w:cs="Times New Roman"/>
+                <w:sz w:val="26"/>
+                <w:szCs w:val="26"/>
+              </w:rPr>
               <w:t xml:space="preserve"> </w:t>
             </w:r>
             <w:proofErr w:type="spellStart"/>
             <w:r>
+              <w:rPr>
+                <w:rFonts w:ascii="Times New Roman" w:hAnsi="Times New Roman" w:cs="Times New Roman"/>
+                <w:sz w:val="26"/>
+                <w:szCs w:val="26"/>
+              </w:rPr>
               <w:t>đặt</w:t>
             </w:r>
             <w:proofErr w:type="spellEnd"/>
             <w:r>
+              <w:rPr>
+                <w:rFonts w:ascii="Times New Roman" w:hAnsi="Times New Roman" w:cs="Times New Roman"/>
+                <w:sz w:val="26"/>
+                <w:szCs w:val="26"/>
+              </w:rPr>
               <w:t xml:space="preserve"> </w:t>
             </w:r>
             <w:proofErr w:type="spellStart"/>
             <w:r>
+              <w:rPr>
+                <w:rFonts w:ascii="Times New Roman" w:hAnsi="Times New Roman" w:cs="Times New Roman"/>
+                <w:sz w:val="26"/>
+                <w:szCs w:val="26"/>
+              </w:rPr>
               <w:t>và</w:t>
             </w:r>
             <w:proofErr w:type="spellEnd"/>
             <w:r>
+              <w:rPr>
+                <w:rFonts w:ascii="Times New Roman" w:hAnsi="Times New Roman" w:cs="Times New Roman"/>
+                <w:sz w:val="26"/>
+                <w:szCs w:val="26"/>
+              </w:rPr>
               <w:t xml:space="preserve"> </w:t>
             </w:r>
             <w:proofErr w:type="spellStart"/>
             <w:r>
+              <w:rPr>
+                <w:rFonts w:ascii="Times New Roman" w:hAnsi="Times New Roman" w:cs="Times New Roman"/>
+                <w:sz w:val="26"/>
+                <w:szCs w:val="26"/>
+              </w:rPr>
               <w:t>cấu</w:t>
             </w:r>
             <w:proofErr w:type="spellEnd"/>
             <w:r>
+              <w:rPr>
+                <w:rFonts w:ascii="Times New Roman" w:hAnsi="Times New Roman" w:cs="Times New Roman"/>
+                <w:sz w:val="26"/>
+                <w:szCs w:val="26"/>
+              </w:rPr>
               <w:t xml:space="preserve"> </w:t>
             </w:r>
             <w:proofErr w:type="spellStart"/>
             <w:r>
+              <w:rPr>
+                <w:rFonts w:ascii="Times New Roman" w:hAnsi="Times New Roman" w:cs="Times New Roman"/>
+                <w:sz w:val="26"/>
+                <w:szCs w:val="26"/>
+              </w:rPr>
               <w:t>hình</w:t>
             </w:r>
             <w:proofErr w:type="spellEnd"/>
             <w:r>
+              <w:rPr>
+                <w:rFonts w:ascii="Times New Roman" w:hAnsi="Times New Roman" w:cs="Times New Roman"/>
+                <w:sz w:val="26"/>
+                <w:szCs w:val="26"/>
+              </w:rPr>
               <w:t xml:space="preserve"> server </w:t>
             </w:r>
             <w:proofErr w:type="spellStart"/>
             <w:r>
+              <w:rPr>
+                <w:rFonts w:ascii="Times New Roman" w:hAnsi="Times New Roman" w:cs="Times New Roman"/>
+                <w:sz w:val="26"/>
+                <w:szCs w:val="26"/>
+              </w:rPr>
               <w:t>bên</w:t>
             </w:r>
             <w:proofErr w:type="spellEnd"/>
             <w:r>
+              <w:rPr>
+                <w:rFonts w:ascii="Times New Roman" w:hAnsi="Times New Roman" w:cs="Times New Roman"/>
+                <w:sz w:val="26"/>
+                <w:szCs w:val="26"/>
+              </w:rPr>
               <w:t xml:space="preserve"> </w:t>
             </w:r>
             <w:proofErr w:type="spellStart"/>
             <w:r>
+              <w:rPr>
+                <w:rFonts w:ascii="Times New Roman" w:hAnsi="Times New Roman" w:cs="Times New Roman"/>
+                <w:sz w:val="26"/>
+                <w:szCs w:val="26"/>
+              </w:rPr>
               <w:t>ngoài</w:t>
             </w:r>
             <w:proofErr w:type="spellEnd"/>
             <w:r>
+              <w:rPr>
+                <w:rFonts w:ascii="Times New Roman" w:hAnsi="Times New Roman" w:cs="Times New Roman"/>
+                <w:sz w:val="26"/>
+                <w:szCs w:val="26"/>
+              </w:rPr>
               <w:t xml:space="preserve"> (Tomcat, Jetty...).</w:t>
             </w:r>
           </w:p>
@@ -2226,36 +2545,83 @@
             <w:hideMark/>
           </w:tcPr>
           <w:p>
+            <w:pPr>
+              <w:rPr>
+                <w:rFonts w:ascii="Times New Roman" w:hAnsi="Times New Roman" w:cs="Times New Roman"/>
+                <w:sz w:val="26"/>
+                <w:szCs w:val="26"/>
+              </w:rPr>
+            </w:pPr>
             <w:proofErr w:type="spellStart"/>
             <w:r>
+              <w:rPr>
+                <w:rFonts w:ascii="Times New Roman" w:hAnsi="Times New Roman" w:cs="Times New Roman"/>
+                <w:sz w:val="26"/>
+                <w:szCs w:val="26"/>
+              </w:rPr>
               <w:t>Tích</w:t>
             </w:r>
             <w:proofErr w:type="spellEnd"/>
             <w:r>
+              <w:rPr>
+                <w:rFonts w:ascii="Times New Roman" w:hAnsi="Times New Roman" w:cs="Times New Roman"/>
+                <w:sz w:val="26"/>
+                <w:szCs w:val="26"/>
+              </w:rPr>
               <w:t xml:space="preserve"> </w:t>
             </w:r>
             <w:proofErr w:type="spellStart"/>
             <w:r>
+              <w:rPr>
+                <w:rFonts w:ascii="Times New Roman" w:hAnsi="Times New Roman" w:cs="Times New Roman"/>
+                <w:sz w:val="26"/>
+                <w:szCs w:val="26"/>
+              </w:rPr>
               <w:t>hợp</w:t>
             </w:r>
             <w:proofErr w:type="spellEnd"/>
             <w:r>
+              <w:rPr>
+                <w:rFonts w:ascii="Times New Roman" w:hAnsi="Times New Roman" w:cs="Times New Roman"/>
+                <w:sz w:val="26"/>
+                <w:szCs w:val="26"/>
+              </w:rPr>
               <w:t xml:space="preserve"> </w:t>
             </w:r>
             <w:proofErr w:type="spellStart"/>
             <w:r>
+              <w:rPr>
+                <w:rFonts w:ascii="Times New Roman" w:hAnsi="Times New Roman" w:cs="Times New Roman"/>
+                <w:sz w:val="26"/>
+                <w:szCs w:val="26"/>
+              </w:rPr>
               <w:t>sẵn</w:t>
             </w:r>
             <w:proofErr w:type="spellEnd"/>
             <w:r>
+              <w:rPr>
+                <w:rFonts w:ascii="Times New Roman" w:hAnsi="Times New Roman" w:cs="Times New Roman"/>
+                <w:sz w:val="26"/>
+                <w:szCs w:val="26"/>
+              </w:rPr>
               <w:t xml:space="preserve"> server (Embedded Server) </w:t>
             </w:r>
             <w:proofErr w:type="spellStart"/>
             <w:r>
+              <w:rPr>
+                <w:rFonts w:ascii="Times New Roman" w:hAnsi="Times New Roman" w:cs="Times New Roman"/>
+                <w:sz w:val="26"/>
+                <w:szCs w:val="26"/>
+              </w:rPr>
               <w:t>trong</w:t>
             </w:r>
             <w:proofErr w:type="spellEnd"/>
             <w:r>
+              <w:rPr>
+                <w:rFonts w:ascii="Times New Roman" w:hAnsi="Times New Roman" w:cs="Times New Roman"/>
+                <w:sz w:val="26"/>
+                <w:szCs w:val="26"/>
+              </w:rPr>
               <w:t xml:space="preserve"> file .jar.</w:t>
             </w:r>
           </w:p>
@@ -2284,50 +2650,75 @@
             <w:hideMark/>
           </w:tcPr>
           <w:p>
-            <w:r>
-              <w:rPr>
+            <w:pPr>
+              <w:rPr>
+                <w:rFonts w:ascii="Times New Roman" w:hAnsi="Times New Roman" w:cs="Times New Roman"/>
+                <w:sz w:val="26"/>
+                <w:szCs w:val="26"/>
+              </w:rPr>
+            </w:pPr>
+            <w:r>
+              <w:rPr>
+                <w:rFonts w:ascii="Times New Roman" w:hAnsi="Times New Roman" w:cs="Times New Roman"/>
                 <w:b/>
                 <w:bCs/>
+                <w:sz w:val="26"/>
+                <w:szCs w:val="26"/>
               </w:rPr>
               <w:t xml:space="preserve">Quản </w:t>
             </w:r>
             <w:proofErr w:type="spellStart"/>
             <w:r>
               <w:rPr>
+                <w:rFonts w:ascii="Times New Roman" w:hAnsi="Times New Roman" w:cs="Times New Roman"/>
                 <w:b/>
                 <w:bCs/>
+                <w:sz w:val="26"/>
+                <w:szCs w:val="26"/>
               </w:rPr>
               <w:t>lý</w:t>
             </w:r>
             <w:proofErr w:type="spellEnd"/>
             <w:r>
               <w:rPr>
+                <w:rFonts w:ascii="Times New Roman" w:hAnsi="Times New Roman" w:cs="Times New Roman"/>
                 <w:b/>
                 <w:bCs/>
+                <w:sz w:val="26"/>
+                <w:szCs w:val="26"/>
               </w:rPr>
               <w:t xml:space="preserve"> </w:t>
             </w:r>
             <w:proofErr w:type="spellStart"/>
             <w:r>
               <w:rPr>
+                <w:rFonts w:ascii="Times New Roman" w:hAnsi="Times New Roman" w:cs="Times New Roman"/>
                 <w:b/>
                 <w:bCs/>
+                <w:sz w:val="26"/>
+                <w:szCs w:val="26"/>
               </w:rPr>
               <w:t>thư</w:t>
             </w:r>
             <w:proofErr w:type="spellEnd"/>
             <w:r>
               <w:rPr>
+                <w:rFonts w:ascii="Times New Roman" w:hAnsi="Times New Roman" w:cs="Times New Roman"/>
                 <w:b/>
                 <w:bCs/>
+                <w:sz w:val="26"/>
+                <w:szCs w:val="26"/>
               </w:rPr>
               <w:t xml:space="preserve"> </w:t>
             </w:r>
             <w:proofErr w:type="spellStart"/>
             <w:r>
               <w:rPr>
+                <w:rFonts w:ascii="Times New Roman" w:hAnsi="Times New Roman" w:cs="Times New Roman"/>
                 <w:b/>
                 <w:bCs/>
+                <w:sz w:val="26"/>
+                <w:szCs w:val="26"/>
               </w:rPr>
               <w:t>viện</w:t>
             </w:r>
@@ -2353,132 +2744,299 @@
             <w:hideMark/>
           </w:tcPr>
           <w:p>
+            <w:pPr>
+              <w:rPr>
+                <w:rFonts w:ascii="Times New Roman" w:hAnsi="Times New Roman" w:cs="Times New Roman"/>
+                <w:sz w:val="26"/>
+                <w:szCs w:val="26"/>
+              </w:rPr>
+            </w:pPr>
             <w:proofErr w:type="spellStart"/>
             <w:r>
+              <w:rPr>
+                <w:rFonts w:ascii="Times New Roman" w:hAnsi="Times New Roman" w:cs="Times New Roman"/>
+                <w:sz w:val="26"/>
+                <w:szCs w:val="26"/>
+              </w:rPr>
               <w:t>Phải</w:t>
             </w:r>
             <w:proofErr w:type="spellEnd"/>
             <w:r>
+              <w:rPr>
+                <w:rFonts w:ascii="Times New Roman" w:hAnsi="Times New Roman" w:cs="Times New Roman"/>
+                <w:sz w:val="26"/>
+                <w:szCs w:val="26"/>
+              </w:rPr>
               <w:t xml:space="preserve"> </w:t>
             </w:r>
             <w:proofErr w:type="spellStart"/>
             <w:r>
+              <w:rPr>
+                <w:rFonts w:ascii="Times New Roman" w:hAnsi="Times New Roman" w:cs="Times New Roman"/>
+                <w:sz w:val="26"/>
+                <w:szCs w:val="26"/>
+              </w:rPr>
               <w:t>tự</w:t>
             </w:r>
             <w:proofErr w:type="spellEnd"/>
             <w:r>
+              <w:rPr>
+                <w:rFonts w:ascii="Times New Roman" w:hAnsi="Times New Roman" w:cs="Times New Roman"/>
+                <w:sz w:val="26"/>
+                <w:szCs w:val="26"/>
+              </w:rPr>
               <w:t xml:space="preserve"> </w:t>
             </w:r>
             <w:proofErr w:type="spellStart"/>
             <w:r>
+              <w:rPr>
+                <w:rFonts w:ascii="Times New Roman" w:hAnsi="Times New Roman" w:cs="Times New Roman"/>
+                <w:sz w:val="26"/>
+                <w:szCs w:val="26"/>
+              </w:rPr>
               <w:t>tìm</w:t>
             </w:r>
             <w:proofErr w:type="spellEnd"/>
             <w:r>
+              <w:rPr>
+                <w:rFonts w:ascii="Times New Roman" w:hAnsi="Times New Roman" w:cs="Times New Roman"/>
+                <w:sz w:val="26"/>
+                <w:szCs w:val="26"/>
+              </w:rPr>
               <w:t xml:space="preserve"> </w:t>
             </w:r>
             <w:proofErr w:type="spellStart"/>
             <w:r>
+              <w:rPr>
+                <w:rFonts w:ascii="Times New Roman" w:hAnsi="Times New Roman" w:cs="Times New Roman"/>
+                <w:sz w:val="26"/>
+                <w:szCs w:val="26"/>
+              </w:rPr>
               <w:t>và</w:t>
             </w:r>
             <w:proofErr w:type="spellEnd"/>
             <w:r>
+              <w:rPr>
+                <w:rFonts w:ascii="Times New Roman" w:hAnsi="Times New Roman" w:cs="Times New Roman"/>
+                <w:sz w:val="26"/>
+                <w:szCs w:val="26"/>
+              </w:rPr>
               <w:t xml:space="preserve"> </w:t>
             </w:r>
             <w:proofErr w:type="spellStart"/>
             <w:r>
+              <w:rPr>
+                <w:rFonts w:ascii="Times New Roman" w:hAnsi="Times New Roman" w:cs="Times New Roman"/>
+                <w:sz w:val="26"/>
+                <w:szCs w:val="26"/>
+              </w:rPr>
               <w:t>khai</w:t>
             </w:r>
             <w:proofErr w:type="spellEnd"/>
             <w:r>
+              <w:rPr>
+                <w:rFonts w:ascii="Times New Roman" w:hAnsi="Times New Roman" w:cs="Times New Roman"/>
+                <w:sz w:val="26"/>
+                <w:szCs w:val="26"/>
+              </w:rPr>
               <w:t xml:space="preserve"> </w:t>
             </w:r>
             <w:proofErr w:type="spellStart"/>
             <w:r>
+              <w:rPr>
+                <w:rFonts w:ascii="Times New Roman" w:hAnsi="Times New Roman" w:cs="Times New Roman"/>
+                <w:sz w:val="26"/>
+                <w:szCs w:val="26"/>
+              </w:rPr>
               <w:t>báo</w:t>
             </w:r>
             <w:proofErr w:type="spellEnd"/>
             <w:r>
+              <w:rPr>
+                <w:rFonts w:ascii="Times New Roman" w:hAnsi="Times New Roman" w:cs="Times New Roman"/>
+                <w:sz w:val="26"/>
+                <w:szCs w:val="26"/>
+              </w:rPr>
               <w:t xml:space="preserve"> </w:t>
             </w:r>
             <w:proofErr w:type="spellStart"/>
             <w:r>
+              <w:rPr>
+                <w:rFonts w:ascii="Times New Roman" w:hAnsi="Times New Roman" w:cs="Times New Roman"/>
+                <w:sz w:val="26"/>
+                <w:szCs w:val="26"/>
+              </w:rPr>
               <w:t>từng</w:t>
             </w:r>
             <w:proofErr w:type="spellEnd"/>
             <w:r>
+              <w:rPr>
+                <w:rFonts w:ascii="Times New Roman" w:hAnsi="Times New Roman" w:cs="Times New Roman"/>
+                <w:sz w:val="26"/>
+                <w:szCs w:val="26"/>
+              </w:rPr>
               <w:t xml:space="preserve"> </w:t>
             </w:r>
             <w:proofErr w:type="spellStart"/>
             <w:r>
+              <w:rPr>
+                <w:rFonts w:ascii="Times New Roman" w:hAnsi="Times New Roman" w:cs="Times New Roman"/>
+                <w:sz w:val="26"/>
+                <w:szCs w:val="26"/>
+              </w:rPr>
               <w:t>thư</w:t>
             </w:r>
             <w:proofErr w:type="spellEnd"/>
             <w:r>
+              <w:rPr>
+                <w:rFonts w:ascii="Times New Roman" w:hAnsi="Times New Roman" w:cs="Times New Roman"/>
+                <w:sz w:val="26"/>
+                <w:szCs w:val="26"/>
+              </w:rPr>
               <w:t xml:space="preserve"> </w:t>
             </w:r>
             <w:proofErr w:type="spellStart"/>
             <w:r>
+              <w:rPr>
+                <w:rFonts w:ascii="Times New Roman" w:hAnsi="Times New Roman" w:cs="Times New Roman"/>
+                <w:sz w:val="26"/>
+                <w:szCs w:val="26"/>
+              </w:rPr>
               <w:t>viện</w:t>
             </w:r>
             <w:proofErr w:type="spellEnd"/>
             <w:r>
+              <w:rPr>
+                <w:rFonts w:ascii="Times New Roman" w:hAnsi="Times New Roman" w:cs="Times New Roman"/>
+                <w:sz w:val="26"/>
+                <w:szCs w:val="26"/>
+              </w:rPr>
               <w:t xml:space="preserve">, </w:t>
             </w:r>
             <w:proofErr w:type="spellStart"/>
             <w:r>
+              <w:rPr>
+                <w:rFonts w:ascii="Times New Roman" w:hAnsi="Times New Roman" w:cs="Times New Roman"/>
+                <w:sz w:val="26"/>
+                <w:szCs w:val="26"/>
+              </w:rPr>
               <w:t>dễ</w:t>
             </w:r>
             <w:proofErr w:type="spellEnd"/>
             <w:r>
+              <w:rPr>
+                <w:rFonts w:ascii="Times New Roman" w:hAnsi="Times New Roman" w:cs="Times New Roman"/>
+                <w:sz w:val="26"/>
+                <w:szCs w:val="26"/>
+              </w:rPr>
               <w:t xml:space="preserve"> </w:t>
             </w:r>
             <w:proofErr w:type="spellStart"/>
             <w:r>
+              <w:rPr>
+                <w:rFonts w:ascii="Times New Roman" w:hAnsi="Times New Roman" w:cs="Times New Roman"/>
+                <w:sz w:val="26"/>
+                <w:szCs w:val="26"/>
+              </w:rPr>
               <w:t>xảy</w:t>
             </w:r>
             <w:proofErr w:type="spellEnd"/>
             <w:r>
+              <w:rPr>
+                <w:rFonts w:ascii="Times New Roman" w:hAnsi="Times New Roman" w:cs="Times New Roman"/>
+                <w:sz w:val="26"/>
+                <w:szCs w:val="26"/>
+              </w:rPr>
               <w:t xml:space="preserve"> </w:t>
             </w:r>
             <w:proofErr w:type="spellStart"/>
             <w:r>
+              <w:rPr>
+                <w:rFonts w:ascii="Times New Roman" w:hAnsi="Times New Roman" w:cs="Times New Roman"/>
+                <w:sz w:val="26"/>
+                <w:szCs w:val="26"/>
+              </w:rPr>
               <w:t>ra</w:t>
             </w:r>
             <w:proofErr w:type="spellEnd"/>
             <w:r>
+              <w:rPr>
+                <w:rFonts w:ascii="Times New Roman" w:hAnsi="Times New Roman" w:cs="Times New Roman"/>
+                <w:sz w:val="26"/>
+                <w:szCs w:val="26"/>
+              </w:rPr>
               <w:t xml:space="preserve"> </w:t>
             </w:r>
             <w:proofErr w:type="spellStart"/>
             <w:r>
+              <w:rPr>
+                <w:rFonts w:ascii="Times New Roman" w:hAnsi="Times New Roman" w:cs="Times New Roman"/>
+                <w:sz w:val="26"/>
+                <w:szCs w:val="26"/>
+              </w:rPr>
               <w:t>xung</w:t>
             </w:r>
             <w:proofErr w:type="spellEnd"/>
             <w:r>
+              <w:rPr>
+                <w:rFonts w:ascii="Times New Roman" w:hAnsi="Times New Roman" w:cs="Times New Roman"/>
+                <w:sz w:val="26"/>
+                <w:szCs w:val="26"/>
+              </w:rPr>
               <w:t xml:space="preserve"> </w:t>
             </w:r>
             <w:proofErr w:type="spellStart"/>
             <w:r>
+              <w:rPr>
+                <w:rFonts w:ascii="Times New Roman" w:hAnsi="Times New Roman" w:cs="Times New Roman"/>
+                <w:sz w:val="26"/>
+                <w:szCs w:val="26"/>
+              </w:rPr>
               <w:t>đột</w:t>
             </w:r>
             <w:proofErr w:type="spellEnd"/>
             <w:r>
+              <w:rPr>
+                <w:rFonts w:ascii="Times New Roman" w:hAnsi="Times New Roman" w:cs="Times New Roman"/>
+                <w:sz w:val="26"/>
+                <w:szCs w:val="26"/>
+              </w:rPr>
               <w:t xml:space="preserve"> </w:t>
             </w:r>
             <w:proofErr w:type="spellStart"/>
             <w:r>
+              <w:rPr>
+                <w:rFonts w:ascii="Times New Roman" w:hAnsi="Times New Roman" w:cs="Times New Roman"/>
+                <w:sz w:val="26"/>
+                <w:szCs w:val="26"/>
+              </w:rPr>
               <w:t>phiên</w:t>
             </w:r>
             <w:proofErr w:type="spellEnd"/>
             <w:r>
+              <w:rPr>
+                <w:rFonts w:ascii="Times New Roman" w:hAnsi="Times New Roman" w:cs="Times New Roman"/>
+                <w:sz w:val="26"/>
+                <w:szCs w:val="26"/>
+              </w:rPr>
               <w:t xml:space="preserve"> </w:t>
             </w:r>
             <w:proofErr w:type="spellStart"/>
             <w:r>
+              <w:rPr>
+                <w:rFonts w:ascii="Times New Roman" w:hAnsi="Times New Roman" w:cs="Times New Roman"/>
+                <w:sz w:val="26"/>
+                <w:szCs w:val="26"/>
+              </w:rPr>
               <w:t>bản</w:t>
             </w:r>
             <w:proofErr w:type="spellEnd"/>
             <w:r>
+              <w:rPr>
+                <w:rFonts w:ascii="Times New Roman" w:hAnsi="Times New Roman" w:cs="Times New Roman"/>
+                <w:sz w:val="26"/>
+                <w:szCs w:val="26"/>
+              </w:rPr>
               <w:t>.</w:t>
             </w:r>
           </w:p>
@@ -2502,150 +3060,335 @@
             <w:hideMark/>
           </w:tcPr>
           <w:p>
+            <w:pPr>
+              <w:rPr>
+                <w:rFonts w:ascii="Times New Roman" w:hAnsi="Times New Roman" w:cs="Times New Roman"/>
+                <w:sz w:val="26"/>
+                <w:szCs w:val="26"/>
+              </w:rPr>
+            </w:pPr>
             <w:proofErr w:type="spellStart"/>
             <w:r>
+              <w:rPr>
+                <w:rFonts w:ascii="Times New Roman" w:hAnsi="Times New Roman" w:cs="Times New Roman"/>
+                <w:sz w:val="26"/>
+                <w:szCs w:val="26"/>
+              </w:rPr>
               <w:t>Sử</w:t>
             </w:r>
             <w:proofErr w:type="spellEnd"/>
             <w:r>
+              <w:rPr>
+                <w:rFonts w:ascii="Times New Roman" w:hAnsi="Times New Roman" w:cs="Times New Roman"/>
+                <w:sz w:val="26"/>
+                <w:szCs w:val="26"/>
+              </w:rPr>
               <w:t xml:space="preserve"> </w:t>
             </w:r>
             <w:proofErr w:type="spellStart"/>
             <w:r>
+              <w:rPr>
+                <w:rFonts w:ascii="Times New Roman" w:hAnsi="Times New Roman" w:cs="Times New Roman"/>
+                <w:sz w:val="26"/>
+                <w:szCs w:val="26"/>
+              </w:rPr>
               <w:t>dụng</w:t>
             </w:r>
             <w:proofErr w:type="spellEnd"/>
             <w:r>
+              <w:rPr>
+                <w:rFonts w:ascii="Times New Roman" w:hAnsi="Times New Roman" w:cs="Times New Roman"/>
+                <w:sz w:val="26"/>
+                <w:szCs w:val="26"/>
+              </w:rPr>
               <w:t xml:space="preserve"> </w:t>
             </w:r>
             <w:proofErr w:type="spellStart"/>
             <w:r>
+              <w:rPr>
+                <w:rFonts w:ascii="Times New Roman" w:hAnsi="Times New Roman" w:cs="Times New Roman"/>
+                <w:sz w:val="26"/>
+                <w:szCs w:val="26"/>
+              </w:rPr>
               <w:t>các</w:t>
             </w:r>
             <w:proofErr w:type="spellEnd"/>
             <w:r>
+              <w:rPr>
+                <w:rFonts w:ascii="Times New Roman" w:hAnsi="Times New Roman" w:cs="Times New Roman"/>
+                <w:sz w:val="26"/>
+                <w:szCs w:val="26"/>
+              </w:rPr>
               <w:t xml:space="preserve"> </w:t>
             </w:r>
             <w:r>
               <w:rPr>
+                <w:rFonts w:ascii="Times New Roman" w:hAnsi="Times New Roman" w:cs="Times New Roman"/>
                 <w:b/>
                 <w:bCs/>
+                <w:sz w:val="26"/>
+                <w:szCs w:val="26"/>
               </w:rPr>
               <w:t>Starters</w:t>
             </w:r>
             <w:r>
+              <w:rPr>
+                <w:rFonts w:ascii="Times New Roman" w:hAnsi="Times New Roman" w:cs="Times New Roman"/>
+                <w:sz w:val="26"/>
+                <w:szCs w:val="26"/>
+              </w:rPr>
               <w:t xml:space="preserve">, </w:t>
             </w:r>
             <w:proofErr w:type="spellStart"/>
             <w:r>
+              <w:rPr>
+                <w:rFonts w:ascii="Times New Roman" w:hAnsi="Times New Roman" w:cs="Times New Roman"/>
+                <w:sz w:val="26"/>
+                <w:szCs w:val="26"/>
+              </w:rPr>
               <w:t>tự</w:t>
             </w:r>
             <w:proofErr w:type="spellEnd"/>
             <w:r>
+              <w:rPr>
+                <w:rFonts w:ascii="Times New Roman" w:hAnsi="Times New Roman" w:cs="Times New Roman"/>
+                <w:sz w:val="26"/>
+                <w:szCs w:val="26"/>
+              </w:rPr>
               <w:t xml:space="preserve"> </w:t>
             </w:r>
             <w:proofErr w:type="spellStart"/>
             <w:r>
+              <w:rPr>
+                <w:rFonts w:ascii="Times New Roman" w:hAnsi="Times New Roman" w:cs="Times New Roman"/>
+                <w:sz w:val="26"/>
+                <w:szCs w:val="26"/>
+              </w:rPr>
               <w:t>động</w:t>
             </w:r>
             <w:proofErr w:type="spellEnd"/>
             <w:r>
+              <w:rPr>
+                <w:rFonts w:ascii="Times New Roman" w:hAnsi="Times New Roman" w:cs="Times New Roman"/>
+                <w:sz w:val="26"/>
+                <w:szCs w:val="26"/>
+              </w:rPr>
               <w:t xml:space="preserve"> </w:t>
             </w:r>
             <w:proofErr w:type="spellStart"/>
             <w:r>
+              <w:rPr>
+                <w:rFonts w:ascii="Times New Roman" w:hAnsi="Times New Roman" w:cs="Times New Roman"/>
+                <w:sz w:val="26"/>
+                <w:szCs w:val="26"/>
+              </w:rPr>
               <w:t>quản</w:t>
             </w:r>
             <w:proofErr w:type="spellEnd"/>
             <w:r>
+              <w:rPr>
+                <w:rFonts w:ascii="Times New Roman" w:hAnsi="Times New Roman" w:cs="Times New Roman"/>
+                <w:sz w:val="26"/>
+                <w:szCs w:val="26"/>
+              </w:rPr>
               <w:t xml:space="preserve"> </w:t>
             </w:r>
             <w:proofErr w:type="spellStart"/>
             <w:r>
+              <w:rPr>
+                <w:rFonts w:ascii="Times New Roman" w:hAnsi="Times New Roman" w:cs="Times New Roman"/>
+                <w:sz w:val="26"/>
+                <w:szCs w:val="26"/>
+              </w:rPr>
               <w:t>lý</w:t>
             </w:r>
             <w:proofErr w:type="spellEnd"/>
             <w:r>
+              <w:rPr>
+                <w:rFonts w:ascii="Times New Roman" w:hAnsi="Times New Roman" w:cs="Times New Roman"/>
+                <w:sz w:val="26"/>
+                <w:szCs w:val="26"/>
+              </w:rPr>
               <w:t xml:space="preserve"> </w:t>
             </w:r>
             <w:proofErr w:type="spellStart"/>
             <w:r>
+              <w:rPr>
+                <w:rFonts w:ascii="Times New Roman" w:hAnsi="Times New Roman" w:cs="Times New Roman"/>
+                <w:sz w:val="26"/>
+                <w:szCs w:val="26"/>
+              </w:rPr>
               <w:t>các</w:t>
             </w:r>
             <w:proofErr w:type="spellEnd"/>
             <w:r>
+              <w:rPr>
+                <w:rFonts w:ascii="Times New Roman" w:hAnsi="Times New Roman" w:cs="Times New Roman"/>
+                <w:sz w:val="26"/>
+                <w:szCs w:val="26"/>
+              </w:rPr>
               <w:t xml:space="preserve"> </w:t>
             </w:r>
             <w:proofErr w:type="spellStart"/>
             <w:r>
+              <w:rPr>
+                <w:rFonts w:ascii="Times New Roman" w:hAnsi="Times New Roman" w:cs="Times New Roman"/>
+                <w:sz w:val="26"/>
+                <w:szCs w:val="26"/>
+              </w:rPr>
               <w:t>thư</w:t>
             </w:r>
             <w:proofErr w:type="spellEnd"/>
             <w:r>
+              <w:rPr>
+                <w:rFonts w:ascii="Times New Roman" w:hAnsi="Times New Roman" w:cs="Times New Roman"/>
+                <w:sz w:val="26"/>
+                <w:szCs w:val="26"/>
+              </w:rPr>
               <w:t xml:space="preserve"> </w:t>
             </w:r>
             <w:proofErr w:type="spellStart"/>
             <w:r>
+              <w:rPr>
+                <w:rFonts w:ascii="Times New Roman" w:hAnsi="Times New Roman" w:cs="Times New Roman"/>
+                <w:sz w:val="26"/>
+                <w:szCs w:val="26"/>
+              </w:rPr>
               <w:t>viện</w:t>
             </w:r>
             <w:proofErr w:type="spellEnd"/>
             <w:r>
+              <w:rPr>
+                <w:rFonts w:ascii="Times New Roman" w:hAnsi="Times New Roman" w:cs="Times New Roman"/>
+                <w:sz w:val="26"/>
+                <w:szCs w:val="26"/>
+              </w:rPr>
               <w:t xml:space="preserve"> </w:t>
             </w:r>
             <w:proofErr w:type="spellStart"/>
             <w:r>
+              <w:rPr>
+                <w:rFonts w:ascii="Times New Roman" w:hAnsi="Times New Roman" w:cs="Times New Roman"/>
+                <w:sz w:val="26"/>
+                <w:szCs w:val="26"/>
+              </w:rPr>
               <w:t>liên</w:t>
             </w:r>
             <w:proofErr w:type="spellEnd"/>
             <w:r>
+              <w:rPr>
+                <w:rFonts w:ascii="Times New Roman" w:hAnsi="Times New Roman" w:cs="Times New Roman"/>
+                <w:sz w:val="26"/>
+                <w:szCs w:val="26"/>
+              </w:rPr>
               <w:t xml:space="preserve"> </w:t>
             </w:r>
             <w:proofErr w:type="spellStart"/>
             <w:r>
+              <w:rPr>
+                <w:rFonts w:ascii="Times New Roman" w:hAnsi="Times New Roman" w:cs="Times New Roman"/>
+                <w:sz w:val="26"/>
+                <w:szCs w:val="26"/>
+              </w:rPr>
               <w:t>quan</w:t>
             </w:r>
             <w:proofErr w:type="spellEnd"/>
             <w:r>
+              <w:rPr>
+                <w:rFonts w:ascii="Times New Roman" w:hAnsi="Times New Roman" w:cs="Times New Roman"/>
+                <w:sz w:val="26"/>
+                <w:szCs w:val="26"/>
+              </w:rPr>
               <w:t xml:space="preserve"> </w:t>
             </w:r>
             <w:proofErr w:type="spellStart"/>
             <w:r>
+              <w:rPr>
+                <w:rFonts w:ascii="Times New Roman" w:hAnsi="Times New Roman" w:cs="Times New Roman"/>
+                <w:sz w:val="26"/>
+                <w:szCs w:val="26"/>
+              </w:rPr>
               <w:t>và</w:t>
             </w:r>
             <w:proofErr w:type="spellEnd"/>
             <w:r>
+              <w:rPr>
+                <w:rFonts w:ascii="Times New Roman" w:hAnsi="Times New Roman" w:cs="Times New Roman"/>
+                <w:sz w:val="26"/>
+                <w:szCs w:val="26"/>
+              </w:rPr>
               <w:t xml:space="preserve"> </w:t>
             </w:r>
             <w:proofErr w:type="spellStart"/>
             <w:r>
+              <w:rPr>
+                <w:rFonts w:ascii="Times New Roman" w:hAnsi="Times New Roman" w:cs="Times New Roman"/>
+                <w:sz w:val="26"/>
+                <w:szCs w:val="26"/>
+              </w:rPr>
               <w:t>phiên</w:t>
             </w:r>
             <w:proofErr w:type="spellEnd"/>
             <w:r>
+              <w:rPr>
+                <w:rFonts w:ascii="Times New Roman" w:hAnsi="Times New Roman" w:cs="Times New Roman"/>
+                <w:sz w:val="26"/>
+                <w:szCs w:val="26"/>
+              </w:rPr>
               <w:t xml:space="preserve"> </w:t>
             </w:r>
             <w:proofErr w:type="spellStart"/>
             <w:r>
+              <w:rPr>
+                <w:rFonts w:ascii="Times New Roman" w:hAnsi="Times New Roman" w:cs="Times New Roman"/>
+                <w:sz w:val="26"/>
+                <w:szCs w:val="26"/>
+              </w:rPr>
               <w:t>bản</w:t>
             </w:r>
             <w:proofErr w:type="spellEnd"/>
             <w:r>
+              <w:rPr>
+                <w:rFonts w:ascii="Times New Roman" w:hAnsi="Times New Roman" w:cs="Times New Roman"/>
+                <w:sz w:val="26"/>
+                <w:szCs w:val="26"/>
+              </w:rPr>
               <w:t xml:space="preserve"> </w:t>
             </w:r>
             <w:proofErr w:type="spellStart"/>
             <w:r>
+              <w:rPr>
+                <w:rFonts w:ascii="Times New Roman" w:hAnsi="Times New Roman" w:cs="Times New Roman"/>
+                <w:sz w:val="26"/>
+                <w:szCs w:val="26"/>
+              </w:rPr>
               <w:t>tương</w:t>
             </w:r>
             <w:proofErr w:type="spellEnd"/>
             <w:r>
+              <w:rPr>
+                <w:rFonts w:ascii="Times New Roman" w:hAnsi="Times New Roman" w:cs="Times New Roman"/>
+                <w:sz w:val="26"/>
+                <w:szCs w:val="26"/>
+              </w:rPr>
               <w:t xml:space="preserve"> </w:t>
             </w:r>
             <w:proofErr w:type="spellStart"/>
             <w:r>
+              <w:rPr>
+                <w:rFonts w:ascii="Times New Roman" w:hAnsi="Times New Roman" w:cs="Times New Roman"/>
+                <w:sz w:val="26"/>
+                <w:szCs w:val="26"/>
+              </w:rPr>
               <w:t>thích</w:t>
             </w:r>
             <w:proofErr w:type="spellEnd"/>
             <w:r>
+              <w:rPr>
+                <w:rFonts w:ascii="Times New Roman" w:hAnsi="Times New Roman" w:cs="Times New Roman"/>
+                <w:sz w:val="26"/>
+                <w:szCs w:val="26"/>
+              </w:rPr>
               <w:t>.</w:t>
             </w:r>
           </w:p>
@@ -4155,7 +4898,7 @@
     <w:p>
       <w:r>
         <w:pict w14:anchorId="6963105D">
-          <v:rect id="_x0000_i1051" style="width:0;height:1.5pt" o:hralign="center" o:hrstd="t" o:hrnoshade="t" o:hr="t" fillcolor="gray" stroked="f"/>
+          <v:rect id="_x0000_i1025" style="width:0;height:1.5pt" o:hralign="center" o:hrstd="t" o:hrnoshade="t" o:hr="t" fillcolor="gray" stroked="f"/>
         </w:pict>
       </w:r>
     </w:p>
@@ -5649,10 +6392,11 @@
       </w:r>
     </w:p>
     <w:p/>
-    <w:p/>
-    <w:p/>
     <w:p>
       <w:r>
+        <w:rPr>
+          <w:noProof/>
+        </w:rPr>
         <w:drawing>
           <wp:inline distT="0" distB="0" distL="0" distR="0" wp14:anchorId="6D13B714" wp14:editId="38E9CD37">
             <wp:extent cx="5943600" cy="2821940"/>
@@ -7241,6 +7985,7 @@
   <w:style w:type="character" w:default="1" w:styleId="DefaultParagraphFont">
     <w:name w:val="Default Paragraph Font"/>
     <w:uiPriority w:val="1"/>
+    <w:semiHidden/>
     <w:unhideWhenUsed/>
   </w:style>
   <w:style w:type="table" w:default="1" w:styleId="TableNormal">

</xml_diff>